<commit_message>
Rewrite pitch speech in plain language (one A4 page)
Co-authored-by: arena-agent <297053741+arena-agent@users.noreply.github.com>
</commit_message>
<xml_diff>
--- a/presentation/Текст_выступления_СинтексПруф.docx
+++ b/presentation/Текст_выступления_СинтексПруф.docx
@@ -24,7 +24,7 @@
           <w:rFonts w:ascii="Arial" w:hAnsi="Arial"/>
           <w:sz w:val="22"/>
         </w:rPr>
-        <w:t>Добрый день! Меня зовут Исмаилов Ислам, я руководитель проекта «СинтексПруф» — платформы статического анализа и ИИ-ревью production-кода для ИТ-команд.</w:t>
+        <w:t>Добрый день! Меня зовут Исмаилов Ислам. Я представляю проект «СинтексПруф» — программу, которая помогает проверять код до того, как он попадёт в работу.</w:t>
       </w:r>
     </w:p>
     <w:p>
@@ -37,14 +37,14 @@
           <w:b/>
           <w:sz w:val="22"/>
         </w:rPr>
-        <w:t xml:space="preserve">Проблема. </w:t>
+        <w:t xml:space="preserve">В чём проблема. </w:t>
       </w:r>
       <w:r>
         <w:rPr>
           <w:rFonts w:ascii="Arial" w:hAnsi="Arial"/>
           <w:sz w:val="22"/>
         </w:rPr>
-        <w:t>Ревью кода стало узким местом разработки: разработчики тратят до 20–30% времени на ручное ревью, pull request ждёт ревьюера по 7–15 часов, а поток изменений растёт — микросервисы, CI/CD и всё больше кода от ИИ-ассистентов, который проверять сложнее.</w:t>
+        <w:t>Любая ИТ-команда проверяет код вручную: опытный разработчик читает чужие правки, и на это уходит до четверти его рабочего времени. Ждать проверки приходится часами, иногда сутками. А кода становится всё больше — его пишут и люди, и нейросети, и всё это нужно проверять.</w:t>
       </w:r>
     </w:p>
     <w:p>
@@ -57,14 +57,14 @@
           <w:b/>
           <w:sz w:val="22"/>
         </w:rPr>
-        <w:t xml:space="preserve">Решение. </w:t>
+        <w:t xml:space="preserve">Наше решение. </w:t>
       </w:r>
       <w:r>
         <w:rPr>
           <w:rFonts w:ascii="Arial" w:hAnsi="Arial"/>
           <w:sz w:val="22"/>
         </w:rPr>
-        <w:t>«СинтексПруф» — первичный фильтр для Code Review: детерминированные проверки находят дефекты и уязвимости, а ИИ объясняет риск и предлагает исправление с привязкой к строкам — прямо в pull request. Наша цель — сократить время ручного ревью и повысить качество production-кода в CI/CD. Точность и экономия пока не подтверждены — измеряем в пилоте.</w:t>
+        <w:t>«СинтексПруф» работает как первый опытный ревьюер. Он сам находит ошибки и слабые места в коде, объясняет, в чём риск, и предлагает, как исправить, — прямо в том месте, где написана проблемная строка. Встраивается в GitHub и GitLab и в систему сборки, то есть работает там же, где работает команда. Можно поставить и на серверы самой компании — код никуда не уходит наружу.</w:t>
       </w:r>
     </w:p>
     <w:p>
@@ -77,14 +77,14 @@
           <w:b/>
           <w:sz w:val="22"/>
         </w:rPr>
-        <w:t xml:space="preserve">Технология. </w:t>
+        <w:t xml:space="preserve">Как это устроено. </w:t>
       </w:r>
       <w:r>
         <w:rPr>
           <w:rFonts w:ascii="Arial" w:hAnsi="Arial"/>
           <w:sz w:val="22"/>
         </w:rPr>
-        <w:t>Пять шагов: ввод кода C/C++/Python, статический анализ, ИИ-ревью, отчёт по строкам с приоритетами Critical/Major/Info и интеграция — GitHub/GitLab, CI/CD, SARIF, REST API. Режимы SaaS и on-prem: код остаётся в контуре команды. Правила сначала, ИИ — для объяснений: так меньше ложных срабатываний, которые убивают доверие к инструменту.</w:t>
+        <w:t>Программа читает код на языках C, C++ и Python, проверяет его по правилам, а нейросеть объясняет находки простыми словами. Правила дают мало ложных тревог — а именно из-за ложных тревог команды выключают подобные инструменты.</w:t>
       </w:r>
     </w:p>
     <w:p>
@@ -97,14 +97,14 @@
           <w:b/>
           <w:sz w:val="22"/>
         </w:rPr>
-        <w:t xml:space="preserve">Конкуренты. </w:t>
+        <w:t xml:space="preserve">Чем мы отличаемся. </w:t>
       </w:r>
       <w:r>
         <w:rPr>
           <w:rFonts w:ascii="Arial" w:hAnsi="Arial"/>
           <w:sz w:val="22"/>
         </w:rPr>
-        <w:t>SonarQube — зрелые правила, но без ИИ-ревью в PR; CodeRabbit и Copilot Review удобны, но работают в облаке. Наша ниша свободна: правила + ИИ + приватный контур. EduNet — дополнительный сценарий, не ядро позиционирования.</w:t>
+        <w:t>Известный инструмент SonarQube хорошо ищет ошибки, но не комментирует правки сам. Сервисы на нейросетях — CodeRabbit, Copilot — удобны, но работают только в облаке, и код приходится отдавать наружу. Мы соединили проверку по правилам, понятные объяснения и работу в закрытом контуре заказчика.</w:t>
       </w:r>
     </w:p>
     <w:p>
@@ -117,14 +117,14 @@
           <w:b/>
           <w:sz w:val="22"/>
         </w:rPr>
-        <w:t xml:space="preserve">Рынок и деньги. </w:t>
+        <w:t xml:space="preserve">Для кого и за сколько. </w:t>
       </w:r>
       <w:r>
         <w:rPr>
           <w:rFonts w:ascii="Arial" w:hAnsi="Arial"/>
           <w:sz w:val="22"/>
         </w:rPr>
-        <w:t>Первичный сегмент — ИТ-команды: разработка, DevOps, AppSec, руководители разработки. Монетизация B2B: подписка per developer / repo / CI-pipeline, on-prem-лицензии и платные пилоты. Для команды из 20 разработчиков экономия на ревью — миллионы рублей в год при стоимости подписки меньше миллиона. Это гипотеза — проверим на пилоте.</w:t>
+        <w:t>Наш покупатель — ИТ-команды: разработчики, руководители, специалисты по безопасности. Платят по подписке — за разработчика или за проект в месяц; для крупных компаний — годовая лицензия с установкой на свои серверы. Команда из двадцати человек экономит на ревью несколько миллионов рублей в год — это наша оценка, проверим её на реальном проекте.</w:t>
       </w:r>
     </w:p>
     <w:p>
@@ -137,14 +137,14 @@
           <w:b/>
           <w:sz w:val="22"/>
         </w:rPr>
-        <w:t xml:space="preserve">Команда и прогресс. </w:t>
+        <w:t xml:space="preserve">Где мы сейчас. </w:t>
       </w:r>
       <w:r>
         <w:rPr>
           <w:rFonts w:ascii="Arial" w:hAnsi="Arial"/>
           <w:sz w:val="22"/>
         </w:rPr>
-        <w:t>Нас пятеро: тимлид, бэкендеры, бизнес-аналитик и дизайнер. Есть рабочее демо и стек Next.js, FastAPI, Docker. Подтверждённых партнёров пока нет — ведём переговоры о пилотной площадке.</w:t>
+        <w:t>Уже есть рабочее демо и команда из пяти человек. Цифр «до и после» пока нет — мы честно это говорим.</w:t>
       </w:r>
     </w:p>
     <w:p>
@@ -157,14 +157,14 @@
           <w:b/>
           <w:sz w:val="22"/>
         </w:rPr>
-        <w:t xml:space="preserve">Планы и запрос. </w:t>
+        <w:t xml:space="preserve">Что дальше и о чём просим. </w:t>
       </w:r>
       <w:r>
         <w:rPr>
           <w:rFonts w:ascii="Arial" w:hAnsi="Arial"/>
           <w:sz w:val="22"/>
         </w:rPr>
-        <w:t>1–2 месяца — MVP с комментариями в PR/MR и CI-интеграцией; 3-й месяц — метрики на реальных PR; 4–5 месяц — пилот в ИТ-команде на реальном репозитории. Нам нужны: пилотная площадка с CI/CD и PR-ревью, независимая экспертиза и проверка B2B-модели. EduNet рассмотрим дополнительно после TechNet-пилота.</w:t>
+        <w:t>Два месяца — доводим продукт до комментариев в запросах на слияние кода; третий месяц — замеряем эффект; к четвёртому–пятому — пилот в настоящей ИТ-команде. И нам нужны три вещи: команда с реальным проектом для пилота, независимая проверка качества и проверка модели продаж.</w:t>
       </w:r>
     </w:p>
     <w:p>
@@ -176,7 +176,7 @@
           <w:rFonts w:ascii="Arial" w:hAnsi="Arial"/>
           <w:sz w:val="22"/>
         </w:rPr>
-        <w:t>Спасибо за внимание! Готовы к вопросам и экспертизе.</w:t>
+        <w:t>Спасибо за внимание! Буду рад вопросам.</w:t>
       </w:r>
     </w:p>
     <w:sectPr>

</xml_diff>